<commit_message>
Alinear Fase 1, carta Gantt y presentación con planificación de 720 horas
Conserva las plantillas originales y actualiza alcance, roles, dependencias y capacidad: 15 horas semanales por integrante durante 18 semanas; 810 horas brutas, 720 planificadas y 90 de reserva. Fechas académicas pendientes de confirmación.
</commit_message>
<xml_diff>
--- a/Fase1/Evidencias Grupales/1.4_APT122_FormativaFase1.docx
+++ b/Fase1/Evidencias Grupales/1.4_APT122_FormativaFase1.docx
@@ -855,7 +855,7 @@
                 <w:noProof/>
                 <w:webHidden/>
               </w:rPr>
-              <w:t>6</w:t>
+              <w:t>7</w:t>
             </w:r>
             <w:r>
               <w:rPr>
@@ -925,7 +925,7 @@
                 <w:noProof/>
                 <w:webHidden/>
               </w:rPr>
-              <w:t>6</w:t>
+              <w:t>7</w:t>
             </w:r>
             <w:r>
               <w:rPr>
@@ -1141,7 +1141,7 @@
                 <w:noProof/>
                 <w:webHidden/>
               </w:rPr>
-              <w:t>8</w:t>
+              <w:t>9</w:t>
             </w:r>
             <w:r>
               <w:rPr>
@@ -1214,7 +1214,7 @@
                 <w:noProof/>
                 <w:webHidden/>
               </w:rPr>
-              <w:t>9</w:t>
+              <w:t>10</w:t>
             </w:r>
             <w:r>
               <w:rPr>
@@ -1287,7 +1287,7 @@
                 <w:noProof/>
                 <w:webHidden/>
               </w:rPr>
-              <w:t>11</w:t>
+              <w:t>12</w:t>
             </w:r>
             <w:r>
               <w:rPr>
@@ -1360,7 +1360,7 @@
                 <w:noProof/>
                 <w:webHidden/>
               </w:rPr>
-              <w:t>12</w:t>
+              <w:t>13</w:t>
             </w:r>
             <w:r>
               <w:rPr>
@@ -1433,7 +1433,7 @@
                 <w:noProof/>
                 <w:webHidden/>
               </w:rPr>
-              <w:t>12</w:t>
+              <w:t>13</w:t>
             </w:r>
             <w:r>
               <w:rPr>
@@ -1506,7 +1506,7 @@
                 <w:noProof/>
                 <w:webHidden/>
               </w:rPr>
-              <w:t>12</w:t>
+              <w:t>13</w:t>
             </w:r>
             <w:r>
               <w:rPr>
@@ -1579,7 +1579,7 @@
                 <w:noProof/>
                 <w:webHidden/>
               </w:rPr>
-              <w:t>12</w:t>
+              <w:t>13</w:t>
             </w:r>
             <w:r>
               <w:rPr>
@@ -1652,7 +1652,7 @@
                 <w:noProof/>
                 <w:webHidden/>
               </w:rPr>
-              <w:t>13</w:t>
+              <w:t>14</w:t>
             </w:r>
             <w:r>
               <w:rPr>
@@ -1725,7 +1725,7 @@
                 <w:noProof/>
                 <w:webHidden/>
               </w:rPr>
-              <w:t>13</w:t>
+              <w:t>14</w:t>
             </w:r>
             <w:r>
               <w:rPr>
@@ -1798,7 +1798,7 @@
                 <w:noProof/>
                 <w:webHidden/>
               </w:rPr>
-              <w:t>13</w:t>
+              <w:t>14</w:t>
             </w:r>
             <w:r>
               <w:rPr>
@@ -1871,7 +1871,7 @@
                 <w:noProof/>
                 <w:webHidden/>
               </w:rPr>
-              <w:t>13</w:t>
+              <w:t>14</w:t>
             </w:r>
             <w:r>
               <w:rPr>
@@ -1944,7 +1944,7 @@
                 <w:noProof/>
                 <w:webHidden/>
               </w:rPr>
-              <w:t>14</w:t>
+              <w:t>15</w:t>
             </w:r>
             <w:r>
               <w:rPr>
@@ -2001,15 +2001,7 @@
         <w:jc w:val="both"/>
       </w:pPr>
       <w:r>
-        <w:t xml:space="preserve">El presente informe describe el Proyecto APT SICMA, Sistema Integrado de Control y Monitoreo de Activos, una solución orientada a centralizar el registro, seguimiento y monitoreo de activos tecnológicos en un datacenter simulado. La propuesta integra una plataforma web y móvil, una base de datos MySQL, sensores ESP32, control de acceso biométrico, monitoreo con </w:t>
-      </w:r>
-      <w:proofErr w:type="spellStart"/>
-      <w:r>
-        <w:t>Zabbix</w:t>
-      </w:r>
-      <w:proofErr w:type="spellEnd"/>
-      <w:r>
-        <w:t xml:space="preserve"> y visualización de indicadores con Power BI. El documento fundamenta la relevancia del proyecto para la Ingeniería Informática, su relación con las competencias del perfil de egreso y con los intereses profesionales del equipo, además de justificar su factibilidad. Para reducir la dependencia de las ventanas de intervención del datacenter, el desarrollo se realizará primero en un ambiente simulado y se organizará mediante Kanban, entregas incrementales y prácticas de gestión de cambios. De este modo, SICMA permitirá aplicar competencias de desarrollo de software, modelamiento de datos, gestión de proyectos y validación de productos y procesos.</w:t>
+        <w:t>El informe presenta SICMA, un prototipo para centralizar activos, monitoreo, accesos e intervenciones de un datacenter simulado. Web Angular operativa según rol; móvil Ionic de solo consulta; inventario e historial; ESP32-S3/DHT22 para temperatura y humedad; Zabbix para infraestructura; registro de accesos decididos por HID; solicitudes en Forms, calendario compartido y avisos con Power Automate; indicadores en Power BI. Se organiza mediante Kanban, entregas incrementales y revisión de evidencias. La dedicación confirmada es de 15 horas semanales por integrante: 3 personas × 15 h × 18 semanas = 810 horas-persona (270 por persona). El Kanban agrupa 36 tareas y 720 horas estimadas, con 90 horas de reserva dentro del mismo semestre; no son horas ejecutadas.</w:t>
       </w:r>
     </w:p>
     <w:p>
@@ -2034,725 +2026,8 @@
       <w:pPr>
         <w:jc w:val="both"/>
       </w:pPr>
-      <w:proofErr w:type="spellStart"/>
-      <w:r>
-        <w:t>This</w:t>
-      </w:r>
-      <w:proofErr w:type="spellEnd"/>
-      <w:r>
-        <w:t xml:space="preserve"> </w:t>
-      </w:r>
-      <w:proofErr w:type="spellStart"/>
-      <w:r>
-        <w:t>report</w:t>
-      </w:r>
-      <w:proofErr w:type="spellEnd"/>
-      <w:r>
-        <w:t xml:space="preserve"> </w:t>
-      </w:r>
-      <w:proofErr w:type="spellStart"/>
-      <w:r>
-        <w:t>presents</w:t>
-      </w:r>
-      <w:proofErr w:type="spellEnd"/>
-      <w:r>
-        <w:t xml:space="preserve"> </w:t>
-      </w:r>
-      <w:proofErr w:type="spellStart"/>
-      <w:r>
-        <w:t>the</w:t>
-      </w:r>
-      <w:proofErr w:type="spellEnd"/>
-      <w:r>
-        <w:t xml:space="preserve"> APT Project SICMA, </w:t>
-      </w:r>
-      <w:proofErr w:type="spellStart"/>
-      <w:r>
-        <w:t>an</w:t>
-      </w:r>
-      <w:proofErr w:type="spellEnd"/>
-      <w:r>
-        <w:t xml:space="preserve"> </w:t>
-      </w:r>
-      <w:proofErr w:type="spellStart"/>
-      <w:r>
-        <w:t>Integrated</w:t>
-      </w:r>
-      <w:proofErr w:type="spellEnd"/>
-      <w:r>
-        <w:t xml:space="preserve"> </w:t>
-      </w:r>
-      <w:proofErr w:type="spellStart"/>
-      <w:r>
-        <w:t>Asset</w:t>
-      </w:r>
-      <w:proofErr w:type="spellEnd"/>
-      <w:r>
-        <w:t xml:space="preserve"> Control and </w:t>
-      </w:r>
-      <w:proofErr w:type="spellStart"/>
-      <w:r>
-        <w:t>Monitoring</w:t>
-      </w:r>
-      <w:proofErr w:type="spellEnd"/>
-      <w:r>
-        <w:t xml:space="preserve"> </w:t>
-      </w:r>
-      <w:proofErr w:type="spellStart"/>
-      <w:r>
-        <w:t>System</w:t>
-      </w:r>
-      <w:proofErr w:type="spellEnd"/>
-      <w:r>
-        <w:t xml:space="preserve"> </w:t>
-      </w:r>
-      <w:proofErr w:type="spellStart"/>
-      <w:r>
-        <w:t>designed</w:t>
-      </w:r>
-      <w:proofErr w:type="spellEnd"/>
-      <w:r>
-        <w:t xml:space="preserve"> </w:t>
-      </w:r>
-      <w:proofErr w:type="spellStart"/>
-      <w:r>
-        <w:t>to</w:t>
-      </w:r>
-      <w:proofErr w:type="spellEnd"/>
-      <w:r>
-        <w:t xml:space="preserve"> </w:t>
-      </w:r>
-      <w:proofErr w:type="spellStart"/>
-      <w:r>
-        <w:t>centralize</w:t>
-      </w:r>
-      <w:proofErr w:type="spellEnd"/>
-      <w:r>
-        <w:t xml:space="preserve"> </w:t>
-      </w:r>
-      <w:proofErr w:type="spellStart"/>
-      <w:r>
-        <w:t>the</w:t>
-      </w:r>
-      <w:proofErr w:type="spellEnd"/>
-      <w:r>
-        <w:t xml:space="preserve"> </w:t>
-      </w:r>
-      <w:proofErr w:type="spellStart"/>
-      <w:r>
-        <w:t>registration</w:t>
-      </w:r>
-      <w:proofErr w:type="spellEnd"/>
-      <w:r>
-        <w:t xml:space="preserve">, tracking, and </w:t>
-      </w:r>
-      <w:proofErr w:type="spellStart"/>
-      <w:r>
-        <w:t>monitoring</w:t>
-      </w:r>
-      <w:proofErr w:type="spellEnd"/>
-      <w:r>
-        <w:t xml:space="preserve"> </w:t>
-      </w:r>
-      <w:proofErr w:type="spellStart"/>
-      <w:r>
-        <w:t>of</w:t>
-      </w:r>
-      <w:proofErr w:type="spellEnd"/>
-      <w:r>
-        <w:t xml:space="preserve"> </w:t>
-      </w:r>
-      <w:proofErr w:type="spellStart"/>
-      <w:r>
-        <w:t>technological</w:t>
-      </w:r>
-      <w:proofErr w:type="spellEnd"/>
-      <w:r>
-        <w:t xml:space="preserve"> </w:t>
-      </w:r>
-      <w:proofErr w:type="spellStart"/>
-      <w:r>
-        <w:t>assets</w:t>
-      </w:r>
-      <w:proofErr w:type="spellEnd"/>
-      <w:r>
-        <w:t xml:space="preserve"> in a </w:t>
-      </w:r>
-      <w:proofErr w:type="spellStart"/>
-      <w:r>
-        <w:t>simulated</w:t>
-      </w:r>
-      <w:proofErr w:type="spellEnd"/>
-      <w:r>
-        <w:t xml:space="preserve"> data center. The </w:t>
-      </w:r>
-      <w:proofErr w:type="spellStart"/>
-      <w:r>
-        <w:t>proposal</w:t>
-      </w:r>
-      <w:proofErr w:type="spellEnd"/>
-      <w:r>
-        <w:t xml:space="preserve"> </w:t>
-      </w:r>
-      <w:proofErr w:type="spellStart"/>
-      <w:r>
-        <w:t>integrates</w:t>
-      </w:r>
-      <w:proofErr w:type="spellEnd"/>
-      <w:r>
-        <w:t xml:space="preserve"> a web and </w:t>
-      </w:r>
-      <w:proofErr w:type="spellStart"/>
-      <w:r>
-        <w:t>mobile</w:t>
-      </w:r>
-      <w:proofErr w:type="spellEnd"/>
-      <w:r>
-        <w:t xml:space="preserve"> </w:t>
-      </w:r>
-      <w:proofErr w:type="spellStart"/>
-      <w:r>
-        <w:t>platform</w:t>
-      </w:r>
-      <w:proofErr w:type="spellEnd"/>
-      <w:r>
-        <w:t xml:space="preserve">, a MySQL </w:t>
-      </w:r>
-      <w:proofErr w:type="spellStart"/>
-      <w:r>
-        <w:t>database</w:t>
-      </w:r>
-      <w:proofErr w:type="spellEnd"/>
-      <w:r>
-        <w:t xml:space="preserve">, ESP32-based </w:t>
-      </w:r>
-      <w:proofErr w:type="spellStart"/>
-      <w:r>
-        <w:t>sensors</w:t>
-      </w:r>
-      <w:proofErr w:type="spellEnd"/>
-      <w:r>
-        <w:t xml:space="preserve">, </w:t>
-      </w:r>
-      <w:proofErr w:type="spellStart"/>
-      <w:r>
-        <w:t>biometric</w:t>
-      </w:r>
-      <w:proofErr w:type="spellEnd"/>
-      <w:r>
-        <w:t xml:space="preserve"> </w:t>
-      </w:r>
-      <w:proofErr w:type="spellStart"/>
-      <w:r>
-        <w:t>access</w:t>
-      </w:r>
-      <w:proofErr w:type="spellEnd"/>
-      <w:r>
-        <w:t xml:space="preserve"> control, </w:t>
-      </w:r>
-      <w:proofErr w:type="spellStart"/>
-      <w:r>
-        <w:t>Zabbix</w:t>
-      </w:r>
-      <w:proofErr w:type="spellEnd"/>
-      <w:r>
-        <w:t xml:space="preserve"> </w:t>
-      </w:r>
-      <w:proofErr w:type="spellStart"/>
-      <w:r>
-        <w:t>monitoring</w:t>
-      </w:r>
-      <w:proofErr w:type="spellEnd"/>
-      <w:r>
-        <w:t xml:space="preserve">, and Power BI </w:t>
-      </w:r>
-      <w:proofErr w:type="spellStart"/>
-      <w:r>
-        <w:t>dashboards</w:t>
-      </w:r>
-      <w:proofErr w:type="spellEnd"/>
-      <w:r>
-        <w:t xml:space="preserve">. The </w:t>
-      </w:r>
-      <w:proofErr w:type="spellStart"/>
-      <w:r>
-        <w:t>report</w:t>
-      </w:r>
-      <w:proofErr w:type="spellEnd"/>
-      <w:r>
-        <w:t xml:space="preserve"> </w:t>
-      </w:r>
-      <w:proofErr w:type="spellStart"/>
-      <w:r>
-        <w:t>explains</w:t>
-      </w:r>
-      <w:proofErr w:type="spellEnd"/>
-      <w:r>
-        <w:t xml:space="preserve"> </w:t>
-      </w:r>
-      <w:proofErr w:type="spellStart"/>
-      <w:r>
-        <w:t>the</w:t>
-      </w:r>
-      <w:proofErr w:type="spellEnd"/>
-      <w:r>
-        <w:t xml:space="preserve"> </w:t>
-      </w:r>
-      <w:proofErr w:type="spellStart"/>
-      <w:r>
-        <w:t>project’s</w:t>
-      </w:r>
-      <w:proofErr w:type="spellEnd"/>
-      <w:r>
-        <w:t xml:space="preserve"> </w:t>
-      </w:r>
-      <w:proofErr w:type="spellStart"/>
-      <w:r>
-        <w:t>relevance</w:t>
-      </w:r>
-      <w:proofErr w:type="spellEnd"/>
-      <w:r>
-        <w:t xml:space="preserve"> </w:t>
-      </w:r>
-      <w:proofErr w:type="spellStart"/>
-      <w:r>
-        <w:t>to</w:t>
-      </w:r>
-      <w:proofErr w:type="spellEnd"/>
-      <w:r>
-        <w:t xml:space="preserve"> </w:t>
-      </w:r>
-      <w:proofErr w:type="spellStart"/>
-      <w:r>
-        <w:t>Informatics</w:t>
-      </w:r>
-      <w:proofErr w:type="spellEnd"/>
-      <w:r>
-        <w:t xml:space="preserve"> </w:t>
-      </w:r>
-      <w:proofErr w:type="spellStart"/>
-      <w:r>
-        <w:t>Engineering</w:t>
-      </w:r>
-      <w:proofErr w:type="spellEnd"/>
-      <w:r>
-        <w:t xml:space="preserve">, </w:t>
-      </w:r>
-      <w:proofErr w:type="spellStart"/>
-      <w:r>
-        <w:t>its</w:t>
-      </w:r>
-      <w:proofErr w:type="spellEnd"/>
-      <w:r>
-        <w:t xml:space="preserve"> </w:t>
-      </w:r>
-      <w:proofErr w:type="spellStart"/>
-      <w:r>
-        <w:t>relationship</w:t>
-      </w:r>
-      <w:proofErr w:type="spellEnd"/>
-      <w:r>
-        <w:t xml:space="preserve"> </w:t>
-      </w:r>
-      <w:proofErr w:type="spellStart"/>
-      <w:r>
-        <w:t>with</w:t>
-      </w:r>
-      <w:proofErr w:type="spellEnd"/>
-      <w:r>
-        <w:t xml:space="preserve"> </w:t>
-      </w:r>
-      <w:proofErr w:type="spellStart"/>
-      <w:r>
-        <w:t>the</w:t>
-      </w:r>
-      <w:proofErr w:type="spellEnd"/>
-      <w:r>
-        <w:t xml:space="preserve"> </w:t>
-      </w:r>
-      <w:proofErr w:type="spellStart"/>
-      <w:r>
-        <w:t>graduate</w:t>
-      </w:r>
-      <w:proofErr w:type="spellEnd"/>
-      <w:r>
-        <w:t xml:space="preserve"> </w:t>
-      </w:r>
-      <w:proofErr w:type="spellStart"/>
-      <w:r>
-        <w:t>profile</w:t>
-      </w:r>
-      <w:proofErr w:type="spellEnd"/>
-      <w:r>
-        <w:t xml:space="preserve"> </w:t>
-      </w:r>
-      <w:proofErr w:type="spellStart"/>
-      <w:r>
-        <w:t>competencies</w:t>
-      </w:r>
-      <w:proofErr w:type="spellEnd"/>
-      <w:r>
-        <w:t xml:space="preserve"> and </w:t>
-      </w:r>
-      <w:proofErr w:type="spellStart"/>
-      <w:r>
-        <w:t>the</w:t>
-      </w:r>
-      <w:proofErr w:type="spellEnd"/>
-      <w:r>
-        <w:t xml:space="preserve"> </w:t>
-      </w:r>
-      <w:proofErr w:type="spellStart"/>
-      <w:r>
-        <w:t>team’s</w:t>
-      </w:r>
-      <w:proofErr w:type="spellEnd"/>
-      <w:r>
-        <w:t xml:space="preserve"> </w:t>
-      </w:r>
-      <w:proofErr w:type="spellStart"/>
-      <w:r>
-        <w:t>professional</w:t>
-      </w:r>
-      <w:proofErr w:type="spellEnd"/>
-      <w:r>
-        <w:t xml:space="preserve"> </w:t>
-      </w:r>
-      <w:proofErr w:type="spellStart"/>
-      <w:r>
-        <w:t>interests</w:t>
-      </w:r>
-      <w:proofErr w:type="spellEnd"/>
-      <w:r>
-        <w:t xml:space="preserve">, and </w:t>
-      </w:r>
-      <w:proofErr w:type="spellStart"/>
-      <w:r>
-        <w:t>its</w:t>
-      </w:r>
-      <w:proofErr w:type="spellEnd"/>
-      <w:r>
-        <w:t xml:space="preserve"> </w:t>
-      </w:r>
-      <w:proofErr w:type="spellStart"/>
-      <w:r>
-        <w:t>feasibility</w:t>
-      </w:r>
-      <w:proofErr w:type="spellEnd"/>
-      <w:r>
-        <w:t xml:space="preserve"> </w:t>
-      </w:r>
-      <w:proofErr w:type="spellStart"/>
-      <w:r>
-        <w:t>within</w:t>
-      </w:r>
-      <w:proofErr w:type="spellEnd"/>
-      <w:r>
-        <w:t xml:space="preserve"> one </w:t>
-      </w:r>
-      <w:proofErr w:type="spellStart"/>
-      <w:r>
-        <w:t>academic</w:t>
-      </w:r>
-      <w:proofErr w:type="spellEnd"/>
-      <w:r>
-        <w:t xml:space="preserve"> </w:t>
-      </w:r>
-      <w:proofErr w:type="spellStart"/>
-      <w:r>
-        <w:t>semester</w:t>
-      </w:r>
-      <w:proofErr w:type="spellEnd"/>
-      <w:r>
-        <w:t xml:space="preserve">. </w:t>
-      </w:r>
-      <w:proofErr w:type="spellStart"/>
-      <w:r>
-        <w:t>To</w:t>
-      </w:r>
-      <w:proofErr w:type="spellEnd"/>
-      <w:r>
-        <w:t xml:space="preserve"> reduce </w:t>
-      </w:r>
-      <w:proofErr w:type="spellStart"/>
-      <w:r>
-        <w:t>dependency</w:t>
-      </w:r>
-      <w:proofErr w:type="spellEnd"/>
-      <w:r>
-        <w:t xml:space="preserve"> </w:t>
-      </w:r>
-      <w:proofErr w:type="spellStart"/>
-      <w:r>
-        <w:t>on</w:t>
-      </w:r>
-      <w:proofErr w:type="spellEnd"/>
-      <w:r>
-        <w:t xml:space="preserve"> </w:t>
-      </w:r>
-      <w:proofErr w:type="spellStart"/>
-      <w:r>
-        <w:t>restricted</w:t>
-      </w:r>
-      <w:proofErr w:type="spellEnd"/>
-      <w:r>
-        <w:t xml:space="preserve"> data center </w:t>
-      </w:r>
-      <w:proofErr w:type="spellStart"/>
-      <w:r>
-        <w:t>maintenance</w:t>
-      </w:r>
-      <w:proofErr w:type="spellEnd"/>
-      <w:r>
-        <w:t xml:space="preserve"> </w:t>
-      </w:r>
-      <w:proofErr w:type="spellStart"/>
-      <w:r>
-        <w:t>windows</w:t>
-      </w:r>
-      <w:proofErr w:type="spellEnd"/>
-      <w:r>
-        <w:t xml:space="preserve">, </w:t>
-      </w:r>
-      <w:proofErr w:type="spellStart"/>
-      <w:r>
-        <w:t>the</w:t>
-      </w:r>
-      <w:proofErr w:type="spellEnd"/>
-      <w:r>
-        <w:t xml:space="preserve"> </w:t>
-      </w:r>
-      <w:proofErr w:type="spellStart"/>
-      <w:r>
-        <w:t>solution</w:t>
-      </w:r>
-      <w:proofErr w:type="spellEnd"/>
-      <w:r>
-        <w:t xml:space="preserve"> </w:t>
-      </w:r>
-      <w:proofErr w:type="spellStart"/>
-      <w:r>
-        <w:t>will</w:t>
-      </w:r>
-      <w:proofErr w:type="spellEnd"/>
-      <w:r>
-        <w:t xml:space="preserve"> be </w:t>
-      </w:r>
-      <w:proofErr w:type="spellStart"/>
-      <w:r>
-        <w:t>developed</w:t>
-      </w:r>
-      <w:proofErr w:type="spellEnd"/>
-      <w:r>
-        <w:t xml:space="preserve"> and </w:t>
-      </w:r>
-      <w:proofErr w:type="spellStart"/>
-      <w:r>
-        <w:t>tested</w:t>
-      </w:r>
-      <w:proofErr w:type="spellEnd"/>
-      <w:r>
-        <w:t xml:space="preserve"> </w:t>
-      </w:r>
-      <w:proofErr w:type="spellStart"/>
-      <w:r>
-        <w:t>first</w:t>
-      </w:r>
-      <w:proofErr w:type="spellEnd"/>
-      <w:r>
-        <w:t xml:space="preserve"> in a </w:t>
-      </w:r>
-      <w:proofErr w:type="spellStart"/>
-      <w:r>
-        <w:t>simulated</w:t>
-      </w:r>
-      <w:proofErr w:type="spellEnd"/>
-      <w:r>
-        <w:t xml:space="preserve"> </w:t>
-      </w:r>
-      <w:proofErr w:type="spellStart"/>
-      <w:r>
-        <w:t>environment</w:t>
-      </w:r>
-      <w:proofErr w:type="spellEnd"/>
-      <w:r>
-        <w:t xml:space="preserve">. Work </w:t>
-      </w:r>
-      <w:proofErr w:type="spellStart"/>
-      <w:r>
-        <w:t>will</w:t>
-      </w:r>
-      <w:proofErr w:type="spellEnd"/>
-      <w:r>
-        <w:t xml:space="preserve"> be </w:t>
-      </w:r>
-      <w:proofErr w:type="spellStart"/>
-      <w:r>
-        <w:t>organized</w:t>
-      </w:r>
-      <w:proofErr w:type="spellEnd"/>
-      <w:r>
-        <w:t xml:space="preserve"> </w:t>
-      </w:r>
-      <w:proofErr w:type="spellStart"/>
-      <w:r>
-        <w:t>through</w:t>
-      </w:r>
-      <w:proofErr w:type="spellEnd"/>
-      <w:r>
-        <w:t xml:space="preserve"> Kanban, incremental </w:t>
-      </w:r>
-      <w:proofErr w:type="spellStart"/>
-      <w:r>
-        <w:t>deliveries</w:t>
-      </w:r>
-      <w:proofErr w:type="spellEnd"/>
-      <w:r>
-        <w:t xml:space="preserve">, and </w:t>
-      </w:r>
-      <w:proofErr w:type="spellStart"/>
-      <w:r>
-        <w:t>change-management</w:t>
-      </w:r>
-      <w:proofErr w:type="spellEnd"/>
-      <w:r>
-        <w:t xml:space="preserve"> </w:t>
-      </w:r>
-      <w:proofErr w:type="spellStart"/>
-      <w:r>
-        <w:t>practices</w:t>
-      </w:r>
-      <w:proofErr w:type="spellEnd"/>
-      <w:r>
-        <w:t xml:space="preserve">. SICMA </w:t>
-      </w:r>
-      <w:proofErr w:type="spellStart"/>
-      <w:r>
-        <w:t>will</w:t>
-      </w:r>
-      <w:proofErr w:type="spellEnd"/>
-      <w:r>
-        <w:t xml:space="preserve"> </w:t>
-      </w:r>
-      <w:proofErr w:type="spellStart"/>
-      <w:r>
-        <w:t>therefore</w:t>
-      </w:r>
-      <w:proofErr w:type="spellEnd"/>
-      <w:r>
-        <w:t xml:space="preserve"> </w:t>
-      </w:r>
-      <w:proofErr w:type="spellStart"/>
-      <w:r>
-        <w:t>allow</w:t>
-      </w:r>
-      <w:proofErr w:type="spellEnd"/>
-      <w:r>
-        <w:t xml:space="preserve"> </w:t>
-      </w:r>
-      <w:proofErr w:type="spellStart"/>
-      <w:r>
-        <w:t>the</w:t>
-      </w:r>
-      <w:proofErr w:type="spellEnd"/>
-      <w:r>
-        <w:t xml:space="preserve"> </w:t>
-      </w:r>
-      <w:proofErr w:type="spellStart"/>
-      <w:r>
-        <w:t>team</w:t>
-      </w:r>
-      <w:proofErr w:type="spellEnd"/>
-      <w:r>
-        <w:t xml:space="preserve"> </w:t>
-      </w:r>
-      <w:proofErr w:type="spellStart"/>
-      <w:r>
-        <w:t>to</w:t>
-      </w:r>
-      <w:proofErr w:type="spellEnd"/>
-      <w:r>
-        <w:t xml:space="preserve"> </w:t>
-      </w:r>
-      <w:proofErr w:type="spellStart"/>
-      <w:r>
-        <w:t>apply</w:t>
-      </w:r>
-      <w:proofErr w:type="spellEnd"/>
-      <w:r>
-        <w:t xml:space="preserve"> software </w:t>
-      </w:r>
-      <w:proofErr w:type="spellStart"/>
-      <w:r>
-        <w:t>development</w:t>
-      </w:r>
-      <w:proofErr w:type="spellEnd"/>
-      <w:r>
-        <w:t xml:space="preserve">, </w:t>
-      </w:r>
-      <w:proofErr w:type="spellStart"/>
-      <w:r>
-        <w:t>database</w:t>
-      </w:r>
-      <w:proofErr w:type="spellEnd"/>
-      <w:r>
-        <w:t xml:space="preserve"> </w:t>
-      </w:r>
-      <w:proofErr w:type="spellStart"/>
-      <w:r>
-        <w:t>modeling</w:t>
-      </w:r>
-      <w:proofErr w:type="spellEnd"/>
-      <w:r>
-        <w:t xml:space="preserve">, IT </w:t>
-      </w:r>
-      <w:proofErr w:type="spellStart"/>
-      <w:r>
-        <w:t>project</w:t>
-      </w:r>
-      <w:proofErr w:type="spellEnd"/>
-      <w:r>
-        <w:t xml:space="preserve"> </w:t>
-      </w:r>
-      <w:proofErr w:type="spellStart"/>
-      <w:r>
-        <w:t>management</w:t>
-      </w:r>
-      <w:proofErr w:type="spellEnd"/>
-      <w:r>
-        <w:t xml:space="preserve">, and </w:t>
-      </w:r>
-      <w:proofErr w:type="spellStart"/>
-      <w:r>
-        <w:t>product</w:t>
-      </w:r>
-      <w:proofErr w:type="spellEnd"/>
-      <w:r>
-        <w:t xml:space="preserve"> and </w:t>
-      </w:r>
-      <w:proofErr w:type="spellStart"/>
-      <w:r>
-        <w:t>process</w:t>
-      </w:r>
-      <w:proofErr w:type="spellEnd"/>
-      <w:r>
-        <w:t xml:space="preserve"> </w:t>
-      </w:r>
-      <w:proofErr w:type="spellStart"/>
-      <w:r>
-        <w:t>validation</w:t>
-      </w:r>
-      <w:proofErr w:type="spellEnd"/>
-      <w:r>
-        <w:t xml:space="preserve"> </w:t>
-      </w:r>
-      <w:proofErr w:type="spellStart"/>
-      <w:r>
-        <w:t>competencies</w:t>
-      </w:r>
-      <w:proofErr w:type="spellEnd"/>
-      <w:r>
-        <w:t>.</w:t>
+      <w:r>
+        <w:t>This report presents SICMA, a prototype for a simulated data center. It combines an operational web application, a read-only mobile app, environmental monitoring, HID access events, Zabbix, Forms/Power Automate and Power BI. The three team members each commit 15 hours per week over 18 weeks: 810 person-hours in total. The Kanban estimates total 720 hours, leaving 90 hours of contingency within the semester. These are estimates, not recorded effort or proof of schedule compliance.</w:t>
       </w:r>
     </w:p>
     <w:p>
@@ -2792,7 +2067,7 @@
         <w:jc w:val="both"/>
       </w:pPr>
       <w:r>
-        <w:t>La propuesta surge de la necesidad de mejorar la trazabilidad de los equipos, el seguimiento de las condiciones ambientales, el control de accesos y la detección oportuna de eventos que puedan afectar la continuidad operacional. El informe presenta la descripción y relevancia del proyecto, su relación con las competencias del perfil de egreso y los intereses profesionales del equipo, su factibilidad, objetivos, metodología, plan de trabajo y evidencias. La formulación considera especialmente que las intervenciones sobre un datacenter productivo requieren ventanas de tiempo autorizadas y pueden implicar riesgos para la operación; por ello, SICMA se validará principalmente en un entorno simulado y las pruebas sobre infraestructura serán planificadas y controladas.</w:t>
+        <w:t>La propuesta busca mejorar la trazabilidad de activos, condiciones ambientales, accesos e intervenciones. Se valida en laboratorio; no requiere acceso a un datacenter productivo. La evaluación física de sensores y HID se documentará de forma separada de las simulaciones.</w:t>
       </w:r>
     </w:p>
     <w:p>
@@ -2828,15 +2103,7 @@
         <w:jc w:val="both"/>
       </w:pPr>
       <w:r>
-        <w:t xml:space="preserve">La solución integrará una aplicación web y móvil, un clúster MySQL, sensores ESP32, control de acceso biométrico, </w:t>
-      </w:r>
-      <w:proofErr w:type="spellStart"/>
-      <w:r>
-        <w:t>Zabbix</w:t>
-      </w:r>
-      <w:proofErr w:type="spellEnd"/>
-      <w:r>
-        <w:t xml:space="preserve"> para monitorear el rendimiento y Power BI que será usado para graficar datos relevantes para los administradores del centro de datos. Estos componentes se desarrollarán como módulos interoperables, de manera que el sistema pueda ampliarse progresivamente sin reconstruir toda la solución. Su beneficio principal será centralizar información operativa y entregar mayor trazabilidad sobre los activos y eventos del entorno monitoreado.</w:t>
+        <w:t>Web Angular operativa según rol; móvil Ionic de solo consulta; inventario e historial; ESP32-S3/DHT22 para temperatura y humedad; Zabbix para infraestructura; registro de accesos decididos por HID; solicitudes en Forms, calendario compartido y avisos con Power Automate; indicadores en Power BI. MySQL se plantea en clúster de tres nodos y Router, con un único escritor. Backend, Zabbix y base de datos serán locales; frontend y Power BI se alojarán en la nube.</w:t>
       </w:r>
     </w:p>
     <w:p>
@@ -3435,7 +2702,7 @@
         <w:jc w:val="both"/>
       </w:pPr>
       <w:r>
-        <w:t>SICMA es factible de desarrollar durante el semestre porque el equipo está compuesto por tres integrantes con conocimientos complementarios y dispone de computadores, GitHub y herramientas de desarrollo accesibles. El alcance será controlado mediante un producto mínimo viable que priorice el registro de activos, la recepción de mediciones, la generación de alertas y la visualización de información.</w:t>
+        <w:t>La dedicación confirmada es de 15 horas semanales por integrante: 3 personas × 15 h × 18 semanas = 810 horas-persona (270 por persona). El Kanban agrupa 36 tareas y 720 horas estimadas, con 90 horas de reserva dentro del mismo semestre; no son horas ejecutadas. La carga estimada es de 240 h para Álvaro, 252 h para Fidel y 228 h para Claudio. La factibilidad requiere comprobar también dependencias, horas reales y capacidad semanal.</w:t>
       </w:r>
     </w:p>
     <w:p>
@@ -3443,7 +2710,7 @@
         <w:jc w:val="both"/>
       </w:pPr>
       <w:r>
-        <w:t>La principal dificultad externa corresponde al acceso a un datacenter. En ambientes reales, las intervenciones deben solicitarse con anticipación y ejecutarse durante ventanas autorizadas que no siempre son frecuentes, debido al riesgo de detener o afectar la operación. Para evitar que esta restricción atrase el proyecto, los módulos serán desarrollados y probados primero en un ambiente simulado. Si una ventana se posterga o algún dispositivo no está disponible, se utilizarán datos, servicios y activos simulados. Toda validación sobre infraestructura considerará una solicitud de cambio, evaluación del riesgo, respaldo, criterios de aceptación y plan de reversión.</w:t>
+        <w:t>Los riesgos principales son disponibilidad y compatibilidad de dispositivos, cuentas y licencias; integración dentro del semestre; y evidencias incompletas. Se validarán contratos temprano. Los datos simulados permiten avanzar, pero no acreditan una integración física. Quedan fuera reservas propias y resolución de solapamientos, permisos físicos administrados en SICMA, salud general de dependencias, adjuntos, exportaciones generales y un dashboard analítico web que duplique Power BI. Se mantienen las exclusiones de QR, auditoría general, respaldo lógico, biometría cruda y actuación física.</w:t>
       </w:r>
     </w:p>
     <w:p>
@@ -3558,7 +2825,7 @@
         <w:spacing w:line="276" w:lineRule="auto"/>
       </w:pPr>
       <w:r>
-        <w:t>Desarrollar una plataforma web y una aplicación móvil para gestionar activos, usuarios, accesos e intervenciones.</w:t>
+        <w:t>Desarrollar la plataforma web operativa y una aplicación móvil de solo consulta, con permisos por rol.</w:t>
       </w:r>
     </w:p>
     <w:p>
@@ -3577,15 +2844,7 @@
         <w:spacing w:line="276" w:lineRule="auto"/>
       </w:pPr>
       <w:r>
-        <w:t xml:space="preserve">Implementar el monitoreo de temperatura y humedad mediante sensores ESP32, e integrar el control biométrico, </w:t>
-      </w:r>
-      <w:proofErr w:type="spellStart"/>
-      <w:r>
-        <w:t>Zabbix</w:t>
-      </w:r>
-      <w:proofErr w:type="spellEnd"/>
-      <w:r>
-        <w:t xml:space="preserve"> y Power BI.</w:t>
+        <w:t>Integrar ESP32-S3/DHT22, HID, Zabbix, Forms/Power Automate, SMTP y Power BI.</w:t>
       </w:r>
     </w:p>
     <w:p>
@@ -3868,26 +3127,7 @@
           <w:b/>
           <w:bCs/>
         </w:rPr>
-        <w:t>Álvaro González</w:t>
-      </w:r>
-      <w:r>
-        <w:t xml:space="preserve"> — responsable de infraestructura TI, seguridad informática, integración con </w:t>
-      </w:r>
-      <w:proofErr w:type="spellStart"/>
-      <w:r>
-        <w:t>Zabbix</w:t>
-      </w:r>
-      <w:proofErr w:type="spellEnd"/>
-      <w:r>
-        <w:t xml:space="preserve"> y los dispositivos </w:t>
-      </w:r>
-      <w:proofErr w:type="spellStart"/>
-      <w:r>
-        <w:t>IoT</w:t>
-      </w:r>
-      <w:proofErr w:type="spellEnd"/>
-      <w:r>
-        <w:t>.</w:t>
+        <w:t>Álvaro: backend, infraestructura, seguridad, IoT, HID, Zabbix y SMTP. 240 h estimadas; 30 h de reserva.</w:t>
       </w:r>
     </w:p>
     <w:p>
@@ -3903,10 +3143,7 @@
           <w:b/>
           <w:bCs/>
         </w:rPr>
-        <w:t>Fidel Rodríguez</w:t>
-      </w:r>
-      <w:r>
-        <w:t xml:space="preserve"> — responsable del desarrollo web y móvil, la base de datos y la integración de componentes.</w:t>
+        <w:t>Fidel: web, móvil, modelo de datos, clúster MySQL y Power BI. 252 h estimadas; 18 h de reserva.</w:t>
       </w:r>
     </w:p>
     <w:p>
@@ -3922,10 +3159,7 @@
           <w:b/>
           <w:bCs/>
         </w:rPr>
-        <w:t>Claudio Varas</w:t>
-      </w:r>
-      <w:r>
-        <w:t xml:space="preserve"> — responsable de la planificación, la documentación y la coordinación de las pruebas.</w:t>
+        <w:t>Claudio: planificación, documentación, pruebas y Forms/Power Automate, con apoyo de Álvaro en la API. 228 h estimadas; 42 h de reserva.</w:t>
       </w:r>
     </w:p>
     <w:p>
@@ -3952,7 +3186,7 @@
         <w:jc w:val="both"/>
       </w:pPr>
       <w:r>
-        <w:t>El plan de trabajo organiza el desarrollo de SICMA en las 16 semanas del semestre (septiembre a diciembre de 2026), siguiendo los cuatro incrementos priorizados definidos en la propuesta metodológica. Cada incremento cierra con un hito verificable en el tablero Kanban, lo que permite detectar atrasos de forma temprana y, de ser necesario, reforzar el alcance del producto mínimo viable sin comprometer la entrega final.</w:t>
+        <w:t>Las 18 semanas son relativas: Fase 1 S1–S4, Fase 2 S5–S15 y Fase 3 S16–S18. Falta la fecha oficial de inicio; no se afirma cumplimiento de plazos ni se inventan fechas académicas. La carta Gantt y las actividades A1–A8 se mantienen sincronizadas con el 1.5 y el plan del proyecto. Los incrementos de la tabla se superponen de forma controlada; seguridad y pruebas comienzan antes del cierre funcional.</w:t>
       </w:r>
     </w:p>
     <w:tbl>
@@ -4156,7 +3390,7 @@
                 <w:sz w:val="20"/>
                 <w:szCs w:val="20"/>
               </w:rPr>
-              <w:t>Semanas 1-3 (septiembre)</w:t>
+              <w:t>S1–S5</w:t>
             </w:r>
           </w:p>
         </w:tc>
@@ -4262,7 +3496,7 @@
                 <w:sz w:val="20"/>
                 <w:szCs w:val="20"/>
               </w:rPr>
-              <w:t>Semanas 4-8 (septiembre-octubre)</w:t>
+              <w:t>S4–S16</w:t>
             </w:r>
           </w:p>
         </w:tc>
@@ -4287,7 +3521,7 @@
                 <w:sz w:val="20"/>
                 <w:szCs w:val="20"/>
               </w:rPr>
-              <w:t>Desarrollo de los módulos de gestión de usuarios, activos, accesos e intervenciones sobre la plataforma web y la aplicación móvil.</w:t>
+              <w:t>Web operativa según rol y móvil de consulta; APIs de activos e intervenciones.</w:t>
             </w:r>
           </w:p>
         </w:tc>
@@ -4343,23 +3577,7 @@
                 <w:sz w:val="20"/>
                 <w:szCs w:val="20"/>
               </w:rPr>
-              <w:t xml:space="preserve">3. Monitoreo </w:t>
-            </w:r>
-            <w:proofErr w:type="spellStart"/>
-            <w:r>
-              <w:rPr>
-                <w:sz w:val="20"/>
-                <w:szCs w:val="20"/>
-              </w:rPr>
-              <w:t>IoT</w:t>
-            </w:r>
-            <w:proofErr w:type="spellEnd"/>
-            <w:r>
-              <w:rPr>
-                <w:sz w:val="20"/>
-                <w:szCs w:val="20"/>
-              </w:rPr>
-              <w:t xml:space="preserve"> e integraciones</w:t>
+              <w:t>3. Monitoreo IoT e integraciones</w:t>
             </w:r>
           </w:p>
         </w:tc>
@@ -4384,7 +3602,7 @@
                 <w:sz w:val="20"/>
                 <w:szCs w:val="20"/>
               </w:rPr>
-              <w:t>Semanas 9-12 (octubre-noviembre)</w:t>
+              <w:t>S3–S16</w:t>
             </w:r>
           </w:p>
         </w:tc>
@@ -4409,23 +3627,7 @@
                 <w:sz w:val="20"/>
                 <w:szCs w:val="20"/>
               </w:rPr>
-              <w:t xml:space="preserve">Integración de sensores ESP32, control de acceso biométrico, </w:t>
-            </w:r>
-            <w:proofErr w:type="spellStart"/>
-            <w:r>
-              <w:rPr>
-                <w:sz w:val="20"/>
-                <w:szCs w:val="20"/>
-              </w:rPr>
-              <w:t>Zabbix</w:t>
-            </w:r>
-            <w:proofErr w:type="spellEnd"/>
-            <w:r>
-              <w:rPr>
-                <w:sz w:val="20"/>
-                <w:szCs w:val="20"/>
-              </w:rPr>
-              <w:t xml:space="preserve"> y Power BI para el monitoreo ambiental y de infraestructura.</w:t>
+              <w:t>ESP32-S3/DHT22, HID, Zabbix, Forms/Power Automate, SMTP y Power BI.</w:t>
             </w:r>
           </w:p>
         </w:tc>
@@ -4506,7 +3708,7 @@
                 <w:sz w:val="20"/>
                 <w:szCs w:val="20"/>
               </w:rPr>
-              <w:t>Semanas 13-16 (noviembre-diciembre)</w:t>
+              <w:t>S2–S18</w:t>
             </w:r>
           </w:p>
         </w:tc>
@@ -4572,7 +3774,7 @@
         <w:jc w:val="both"/>
       </w:pPr>
       <w:r>
-        <w:t>Las revisiones periódicas del tablero Kanban permiten contrastar el avance real contra este plan; si una ventana de intervención en el datacenter se posterga, el equipo prioriza tareas del ambiente simulado sin detener el incremento en curso.</w:t>
+        <w:t>La revisión semanal del Kanban contrasta tareas, dependencias, horas reales y capacidad individual de 15 h. Un bloqueo de hardware o licencias se registra y se reprograma sin declarar una validación inexistente.</w:t>
       </w:r>
     </w:p>
     <w:p>
@@ -5576,7 +4778,7 @@
         <w:jc w:val="both"/>
       </w:pPr>
       <w:r>
-        <w:t>Su desarrollo es factible dentro del semestre porque considera un alcance priorizado, trabajo incremental y un ambiente simulado que evita depender permanentemente de un datacenter real. La utilización de Kanban y de prácticas de gestión de cambios permitirá controlar las actividades y preparar de forma segura las validaciones que requieran ventanas autorizadas. Las evidencias definidas permitirán demostrar tanto el producto obtenido como el proceso seguido por el equipo.</w:t>
+        <w:t>La planificación considera 720 horas estimadas y 90 de reserva para un semestre de 18 semanas. Kanban permite revisar carga y bloqueos, mientras las evidencias deben demostrar el producto y sus integraciones. El cumplimiento de plazos se confirmará al vincular semanas con fechas oficiales y resultados reales.</w:t>
       </w:r>
     </w:p>
     <w:p>

</xml_diff>